<commit_message>
New feedbacks added to suggestions and formatting correction
</commit_message>
<xml_diff>
--- a/Iteration_2/Echo_Networking/project_tracker_networking.docx
+++ b/Iteration_2/Echo_Networking/project_tracker_networking.docx
@@ -918,7 +918,132 @@
           <w:sz w:val="24"/>
           <w:szCs w:val="24"/>
         </w:rPr>
-        <w:t>3</w:t>
+        <w:t>3.</w:t>
+      </w:r>
+      <w:r>
+        <w:rPr>
+          <w:rFonts w:ascii="Calibri" w:eastAsia="Calibri" w:hAnsi="Calibri" w:cs="Calibri"/>
+          <w:sz w:val="24"/>
+          <w:szCs w:val="24"/>
+        </w:rPr>
+        <w:t xml:space="preserve"> </w:t>
+      </w:r>
+      <w:r>
+        <w:rPr>
+          <w:rFonts w:ascii="Calibri" w:eastAsia="Calibri" w:hAnsi="Calibri" w:cs="Calibri"/>
+          <w:sz w:val="24"/>
+          <w:szCs w:val="24"/>
+        </w:rPr>
+        <w:t xml:space="preserve">"Being more specific with the previous suggestion, consider breaking down your Diagram tasks into more specific ones (i.e. instead of having a task called "Structure Diagram", create one named </w:t>
+      </w:r>
+      <w:proofErr w:type="spellStart"/>
+      <w:r>
+        <w:rPr>
+          <w:rFonts w:ascii="Calibri" w:eastAsia="Calibri" w:hAnsi="Calibri" w:cs="Calibri"/>
+          <w:sz w:val="24"/>
+          <w:szCs w:val="24"/>
+        </w:rPr>
+        <w:t>AuthenticationClass</w:t>
+      </w:r>
+      <w:proofErr w:type="spellEnd"/>
+      <w:r>
+        <w:rPr>
+          <w:rFonts w:ascii="Calibri" w:eastAsia="Calibri" w:hAnsi="Calibri" w:cs="Calibri"/>
+          <w:sz w:val="24"/>
+          <w:szCs w:val="24"/>
+        </w:rPr>
+        <w:t xml:space="preserve"> Structure Diagram Representation"). When you have a very generic task such as "Structure Diagram", important details are </w:t>
+      </w:r>
+      <w:r>
+        <w:rPr>
+          <w:rFonts w:ascii="Calibri" w:eastAsia="Calibri" w:hAnsi="Calibri" w:cs="Calibri"/>
+          <w:sz w:val="24"/>
+          <w:szCs w:val="24"/>
+        </w:rPr>
+        <w:t>lost,</w:t>
+      </w:r>
+      <w:r>
+        <w:rPr>
+          <w:rFonts w:ascii="Calibri" w:eastAsia="Calibri" w:hAnsi="Calibri" w:cs="Calibri"/>
+          <w:sz w:val="24"/>
+          <w:szCs w:val="24"/>
+        </w:rPr>
+        <w:t xml:space="preserve"> and planning gets harder. </w:t>
+      </w:r>
+    </w:p>
+    <w:p>
+      <w:pPr>
+        <w:pStyle w:val="ListParagraph"/>
+        <w:numPr>
+          <w:ilvl w:val="0"/>
+          <w:numId w:val="3"/>
+        </w:numPr>
+        <w:spacing w:line="360" w:lineRule="auto"/>
+        <w:rPr>
+          <w:rFonts w:ascii="Calibri" w:eastAsia="Calibri" w:hAnsi="Calibri" w:cs="Calibri"/>
+          <w:sz w:val="24"/>
+          <w:szCs w:val="24"/>
+        </w:rPr>
+      </w:pPr>
+      <w:r>
+        <w:rPr>
+          <w:rFonts w:ascii="Calibri" w:eastAsia="Calibri" w:hAnsi="Calibri" w:cs="Calibri"/>
+          <w:sz w:val="24"/>
+          <w:szCs w:val="24"/>
+        </w:rPr>
+        <w:t xml:space="preserve">For instance, in your instance of SD, the only indication of progress is "SD Design completion", but what does this even entail? Considering this is seven hours of work, you ideally need to have more detailed descriptions of what has been accomplished during this long period (i.e. Who completed the Server Relay representation? When did they do it? What </w:t>
+      </w:r>
+      <w:r>
+        <w:rPr>
+          <w:rFonts w:ascii="Calibri" w:eastAsia="Calibri" w:hAnsi="Calibri" w:cs="Calibri"/>
+          <w:sz w:val="24"/>
+          <w:szCs w:val="24"/>
+        </w:rPr>
+        <w:t>is</w:t>
+      </w:r>
+      <w:r>
+        <w:rPr>
+          <w:rFonts w:ascii="Calibri" w:eastAsia="Calibri" w:hAnsi="Calibri" w:cs="Calibri"/>
+          <w:sz w:val="24"/>
+          <w:szCs w:val="24"/>
+        </w:rPr>
+        <w:t xml:space="preserve"> their </w:t>
+      </w:r>
+      <w:r>
+        <w:rPr>
+          <w:rFonts w:ascii="Calibri" w:eastAsia="Calibri" w:hAnsi="Calibri" w:cs="Calibri"/>
+          <w:sz w:val="24"/>
+          <w:szCs w:val="24"/>
+        </w:rPr>
+        <w:t>feedback</w:t>
+      </w:r>
+      <w:r>
+        <w:rPr>
+          <w:rFonts w:ascii="Calibri" w:eastAsia="Calibri" w:hAnsi="Calibri" w:cs="Calibri"/>
+          <w:sz w:val="24"/>
+          <w:szCs w:val="24"/>
+        </w:rPr>
+        <w:t xml:space="preserve"> on it?)"</w:t>
+      </w:r>
+    </w:p>
+    <w:p>
+      <w:pPr>
+        <w:spacing w:line="360" w:lineRule="auto"/>
+        <w:ind w:left="-810"/>
+        <w:rPr>
+          <w:rFonts w:ascii="Calibri" w:eastAsia="Calibri" w:hAnsi="Calibri" w:cs="Calibri"/>
+          <w:sz w:val="24"/>
+          <w:szCs w:val="24"/>
+        </w:rPr>
+      </w:pPr>
+      <w:r>
+        <w:rPr>
+          <w:rFonts w:ascii="Calibri" w:eastAsia="Calibri" w:hAnsi="Calibri" w:cs="Calibri"/>
+          <w:b/>
+          <w:sz w:val="24"/>
+          <w:szCs w:val="24"/>
+        </w:rPr>
+        <w:t>4</w:t>
       </w:r>
       <w:r>
         <w:rPr>
@@ -951,26 +1076,64 @@
           <w:sz w:val="24"/>
           <w:szCs w:val="24"/>
         </w:rPr>
-        <w:t xml:space="preserve"> proper indication of assigned members for the task should be mentioned.</w:t>
-      </w:r>
-    </w:p>
-    <w:p>
-      <w:pPr>
-        <w:spacing w:line="360" w:lineRule="auto"/>
-        <w:ind w:left="-810"/>
-        <w:rPr>
-          <w:rFonts w:ascii="Calibri" w:eastAsia="Calibri" w:hAnsi="Calibri" w:cs="Calibri"/>
-          <w:sz w:val="24"/>
-          <w:szCs w:val="24"/>
-        </w:rPr>
-      </w:pPr>
-      <w:r>
-        <w:rPr>
-          <w:rFonts w:ascii="Calibri" w:eastAsia="Calibri" w:hAnsi="Calibri" w:cs="Calibri"/>
-          <w:sz w:val="24"/>
-          <w:szCs w:val="24"/>
-        </w:rPr>
-        <w:t xml:space="preserve">4. </w:t>
+        <w:t xml:space="preserve"> proper </w:t>
+      </w:r>
+      <w:proofErr w:type="gramStart"/>
+      <w:r>
+        <w:rPr>
+          <w:rFonts w:ascii="Calibri" w:eastAsia="Calibri" w:hAnsi="Calibri" w:cs="Calibri"/>
+          <w:sz w:val="24"/>
+          <w:szCs w:val="24"/>
+        </w:rPr>
+        <w:t>indication</w:t>
+      </w:r>
+      <w:proofErr w:type="gramEnd"/>
+      <w:r>
+        <w:rPr>
+          <w:rFonts w:ascii="Calibri" w:eastAsia="Calibri" w:hAnsi="Calibri" w:cs="Calibri"/>
+          <w:sz w:val="24"/>
+          <w:szCs w:val="24"/>
+        </w:rPr>
+        <w:t xml:space="preserve"> of assigned members for the task should be mentioned.</w:t>
+      </w:r>
+    </w:p>
+    <w:p>
+      <w:pPr>
+        <w:spacing w:line="360" w:lineRule="auto"/>
+        <w:ind w:left="-810"/>
+        <w:rPr>
+          <w:rFonts w:ascii="Calibri" w:eastAsia="Calibri" w:hAnsi="Calibri" w:cs="Calibri"/>
+          <w:sz w:val="24"/>
+          <w:szCs w:val="24"/>
+        </w:rPr>
+      </w:pPr>
+      <w:r>
+        <w:rPr>
+          <w:rFonts w:ascii="Calibri" w:eastAsia="Calibri" w:hAnsi="Calibri" w:cs="Calibri"/>
+          <w:b/>
+          <w:bCs/>
+          <w:sz w:val="24"/>
+          <w:szCs w:val="24"/>
+        </w:rPr>
+        <w:t>5</w:t>
+      </w:r>
+      <w:r>
+        <w:rPr>
+          <w:rFonts w:ascii="Calibri" w:eastAsia="Calibri" w:hAnsi="Calibri" w:cs="Calibri"/>
+          <w:b/>
+          <w:bCs/>
+          <w:sz w:val="24"/>
+          <w:szCs w:val="24"/>
+        </w:rPr>
+        <w:t>.</w:t>
+      </w:r>
+      <w:r>
+        <w:rPr>
+          <w:rFonts w:ascii="Calibri" w:eastAsia="Calibri" w:hAnsi="Calibri" w:cs="Calibri"/>
+          <w:sz w:val="24"/>
+          <w:szCs w:val="24"/>
+        </w:rPr>
+        <w:t xml:space="preserve"> </w:t>
       </w:r>
       <w:r>
         <w:rPr>
@@ -994,27 +1157,45 @@
           <w:sz w:val="24"/>
           <w:szCs w:val="24"/>
         </w:rPr>
-        <w:t xml:space="preserve"> members in the "Setup" section</w:t>
-      </w:r>
-    </w:p>
-    <w:p>
-      <w:pPr>
-        <w:spacing w:line="360" w:lineRule="auto"/>
-        <w:ind w:left="-810"/>
-        <w:rPr>
-          <w:rFonts w:ascii="Calibri" w:eastAsia="Calibri" w:hAnsi="Calibri" w:cs="Calibri"/>
-          <w:sz w:val="24"/>
-          <w:szCs w:val="24"/>
-        </w:rPr>
-      </w:pPr>
-      <w:r>
-        <w:rPr>
-          <w:rFonts w:ascii="Calibri" w:eastAsia="Calibri" w:hAnsi="Calibri" w:cs="Calibri"/>
-          <w:b/>
-          <w:sz w:val="24"/>
-          <w:szCs w:val="24"/>
-        </w:rPr>
-        <w:t>5</w:t>
+        <w:t xml:space="preserve"> members </w:t>
+      </w:r>
+      <w:proofErr w:type="gramStart"/>
+      <w:r>
+        <w:rPr>
+          <w:rFonts w:ascii="Calibri" w:eastAsia="Calibri" w:hAnsi="Calibri" w:cs="Calibri"/>
+          <w:sz w:val="24"/>
+          <w:szCs w:val="24"/>
+        </w:rPr>
+        <w:t>in</w:t>
+      </w:r>
+      <w:proofErr w:type="gramEnd"/>
+      <w:r>
+        <w:rPr>
+          <w:rFonts w:ascii="Calibri" w:eastAsia="Calibri" w:hAnsi="Calibri" w:cs="Calibri"/>
+          <w:sz w:val="24"/>
+          <w:szCs w:val="24"/>
+        </w:rPr>
+        <w:t xml:space="preserve"> the "Setup" section</w:t>
+      </w:r>
+    </w:p>
+    <w:p>
+      <w:pPr>
+        <w:spacing w:line="360" w:lineRule="auto"/>
+        <w:ind w:left="-810"/>
+        <w:rPr>
+          <w:rFonts w:ascii="Calibri" w:eastAsia="Calibri" w:hAnsi="Calibri" w:cs="Calibri"/>
+          <w:sz w:val="24"/>
+          <w:szCs w:val="24"/>
+        </w:rPr>
+      </w:pPr>
+      <w:r>
+        <w:rPr>
+          <w:rFonts w:ascii="Calibri" w:eastAsia="Calibri" w:hAnsi="Calibri" w:cs="Calibri"/>
+          <w:b/>
+          <w:sz w:val="24"/>
+          <w:szCs w:val="24"/>
+        </w:rPr>
+        <w:t>6</w:t>
       </w:r>
       <w:r>
         <w:rPr>
@@ -1051,7 +1232,7 @@
           <w:sz w:val="24"/>
           <w:szCs w:val="24"/>
         </w:rPr>
-        <w:t>6</w:t>
+        <w:t>7</w:t>
       </w:r>
       <w:r>
         <w:rPr>
@@ -1097,6 +1278,15 @@
           <w:szCs w:val="24"/>
         </w:rPr>
       </w:pPr>
+      <w:r>
+        <w:rPr>
+          <w:rFonts w:ascii="Calibri" w:eastAsia="Calibri" w:hAnsi="Calibri" w:cs="Calibri"/>
+          <w:sz w:val="24"/>
+          <w:szCs w:val="24"/>
+        </w:rPr>
+        <w:lastRenderedPageBreak/>
+        <w:t>8. (Extra): Consider also tracking your discussion and feedback meetings, as well as your scrums. Not necessary, but a good addition for more organization</w:t>
+      </w:r>
     </w:p>
     <w:p>
       <w:pPr>
@@ -1299,8 +1489,240 @@
       </w:pPr>
     </w:lvl>
   </w:abstractNum>
+  <w:abstractNum w:abstractNumId="1" w15:restartNumberingAfterBreak="0">
+    <w:nsid w:val="42BF4CE4"/>
+    <w:multiLevelType w:val="hybridMultilevel"/>
+    <w:tmpl w:val="167E6432"/>
+    <w:lvl w:ilvl="0" w:tplc="04090001">
+      <w:start w:val="1"/>
+      <w:numFmt w:val="bullet"/>
+      <w:lvlText w:val=""/>
+      <w:lvlJc w:val="left"/>
+      <w:pPr>
+        <w:ind w:left="-90" w:hanging="360"/>
+      </w:pPr>
+      <w:rPr>
+        <w:rFonts w:ascii="Symbol" w:hAnsi="Symbol" w:hint="default"/>
+      </w:rPr>
+    </w:lvl>
+    <w:lvl w:ilvl="1" w:tplc="04090003" w:tentative="1">
+      <w:start w:val="1"/>
+      <w:numFmt w:val="bullet"/>
+      <w:lvlText w:val="o"/>
+      <w:lvlJc w:val="left"/>
+      <w:pPr>
+        <w:ind w:left="630" w:hanging="360"/>
+      </w:pPr>
+      <w:rPr>
+        <w:rFonts w:ascii="Courier New" w:hAnsi="Courier New" w:cs="Courier New" w:hint="default"/>
+      </w:rPr>
+    </w:lvl>
+    <w:lvl w:ilvl="2" w:tplc="04090005" w:tentative="1">
+      <w:start w:val="1"/>
+      <w:numFmt w:val="bullet"/>
+      <w:lvlText w:val=""/>
+      <w:lvlJc w:val="left"/>
+      <w:pPr>
+        <w:ind w:left="1350" w:hanging="360"/>
+      </w:pPr>
+      <w:rPr>
+        <w:rFonts w:ascii="Wingdings" w:hAnsi="Wingdings" w:hint="default"/>
+      </w:rPr>
+    </w:lvl>
+    <w:lvl w:ilvl="3" w:tplc="04090001" w:tentative="1">
+      <w:start w:val="1"/>
+      <w:numFmt w:val="bullet"/>
+      <w:lvlText w:val=""/>
+      <w:lvlJc w:val="left"/>
+      <w:pPr>
+        <w:ind w:left="2070" w:hanging="360"/>
+      </w:pPr>
+      <w:rPr>
+        <w:rFonts w:ascii="Symbol" w:hAnsi="Symbol" w:hint="default"/>
+      </w:rPr>
+    </w:lvl>
+    <w:lvl w:ilvl="4" w:tplc="04090003" w:tentative="1">
+      <w:start w:val="1"/>
+      <w:numFmt w:val="bullet"/>
+      <w:lvlText w:val="o"/>
+      <w:lvlJc w:val="left"/>
+      <w:pPr>
+        <w:ind w:left="2790" w:hanging="360"/>
+      </w:pPr>
+      <w:rPr>
+        <w:rFonts w:ascii="Courier New" w:hAnsi="Courier New" w:cs="Courier New" w:hint="default"/>
+      </w:rPr>
+    </w:lvl>
+    <w:lvl w:ilvl="5" w:tplc="04090005" w:tentative="1">
+      <w:start w:val="1"/>
+      <w:numFmt w:val="bullet"/>
+      <w:lvlText w:val=""/>
+      <w:lvlJc w:val="left"/>
+      <w:pPr>
+        <w:ind w:left="3510" w:hanging="360"/>
+      </w:pPr>
+      <w:rPr>
+        <w:rFonts w:ascii="Wingdings" w:hAnsi="Wingdings" w:hint="default"/>
+      </w:rPr>
+    </w:lvl>
+    <w:lvl w:ilvl="6" w:tplc="04090001" w:tentative="1">
+      <w:start w:val="1"/>
+      <w:numFmt w:val="bullet"/>
+      <w:lvlText w:val=""/>
+      <w:lvlJc w:val="left"/>
+      <w:pPr>
+        <w:ind w:left="4230" w:hanging="360"/>
+      </w:pPr>
+      <w:rPr>
+        <w:rFonts w:ascii="Symbol" w:hAnsi="Symbol" w:hint="default"/>
+      </w:rPr>
+    </w:lvl>
+    <w:lvl w:ilvl="7" w:tplc="04090003" w:tentative="1">
+      <w:start w:val="1"/>
+      <w:numFmt w:val="bullet"/>
+      <w:lvlText w:val="o"/>
+      <w:lvlJc w:val="left"/>
+      <w:pPr>
+        <w:ind w:left="4950" w:hanging="360"/>
+      </w:pPr>
+      <w:rPr>
+        <w:rFonts w:ascii="Courier New" w:hAnsi="Courier New" w:cs="Courier New" w:hint="default"/>
+      </w:rPr>
+    </w:lvl>
+    <w:lvl w:ilvl="8" w:tplc="04090005" w:tentative="1">
+      <w:start w:val="1"/>
+      <w:numFmt w:val="bullet"/>
+      <w:lvlText w:val=""/>
+      <w:lvlJc w:val="left"/>
+      <w:pPr>
+        <w:ind w:left="5670" w:hanging="360"/>
+      </w:pPr>
+      <w:rPr>
+        <w:rFonts w:ascii="Wingdings" w:hAnsi="Wingdings" w:hint="default"/>
+      </w:rPr>
+    </w:lvl>
+  </w:abstractNum>
+  <w:abstractNum w:abstractNumId="2" w15:restartNumberingAfterBreak="0">
+    <w:nsid w:val="589E793E"/>
+    <w:multiLevelType w:val="hybridMultilevel"/>
+    <w:tmpl w:val="422E36E6"/>
+    <w:lvl w:ilvl="0" w:tplc="04090001">
+      <w:start w:val="1"/>
+      <w:numFmt w:val="bullet"/>
+      <w:lvlText w:val=""/>
+      <w:lvlJc w:val="left"/>
+      <w:pPr>
+        <w:ind w:left="-90" w:hanging="360"/>
+      </w:pPr>
+      <w:rPr>
+        <w:rFonts w:ascii="Symbol" w:hAnsi="Symbol" w:hint="default"/>
+      </w:rPr>
+    </w:lvl>
+    <w:lvl w:ilvl="1" w:tplc="04090003" w:tentative="1">
+      <w:start w:val="1"/>
+      <w:numFmt w:val="bullet"/>
+      <w:lvlText w:val="o"/>
+      <w:lvlJc w:val="left"/>
+      <w:pPr>
+        <w:ind w:left="630" w:hanging="360"/>
+      </w:pPr>
+      <w:rPr>
+        <w:rFonts w:ascii="Courier New" w:hAnsi="Courier New" w:cs="Courier New" w:hint="default"/>
+      </w:rPr>
+    </w:lvl>
+    <w:lvl w:ilvl="2" w:tplc="04090005" w:tentative="1">
+      <w:start w:val="1"/>
+      <w:numFmt w:val="bullet"/>
+      <w:lvlText w:val=""/>
+      <w:lvlJc w:val="left"/>
+      <w:pPr>
+        <w:ind w:left="1350" w:hanging="360"/>
+      </w:pPr>
+      <w:rPr>
+        <w:rFonts w:ascii="Wingdings" w:hAnsi="Wingdings" w:hint="default"/>
+      </w:rPr>
+    </w:lvl>
+    <w:lvl w:ilvl="3" w:tplc="04090001" w:tentative="1">
+      <w:start w:val="1"/>
+      <w:numFmt w:val="bullet"/>
+      <w:lvlText w:val=""/>
+      <w:lvlJc w:val="left"/>
+      <w:pPr>
+        <w:ind w:left="2070" w:hanging="360"/>
+      </w:pPr>
+      <w:rPr>
+        <w:rFonts w:ascii="Symbol" w:hAnsi="Symbol" w:hint="default"/>
+      </w:rPr>
+    </w:lvl>
+    <w:lvl w:ilvl="4" w:tplc="04090003" w:tentative="1">
+      <w:start w:val="1"/>
+      <w:numFmt w:val="bullet"/>
+      <w:lvlText w:val="o"/>
+      <w:lvlJc w:val="left"/>
+      <w:pPr>
+        <w:ind w:left="2790" w:hanging="360"/>
+      </w:pPr>
+      <w:rPr>
+        <w:rFonts w:ascii="Courier New" w:hAnsi="Courier New" w:cs="Courier New" w:hint="default"/>
+      </w:rPr>
+    </w:lvl>
+    <w:lvl w:ilvl="5" w:tplc="04090005" w:tentative="1">
+      <w:start w:val="1"/>
+      <w:numFmt w:val="bullet"/>
+      <w:lvlText w:val=""/>
+      <w:lvlJc w:val="left"/>
+      <w:pPr>
+        <w:ind w:left="3510" w:hanging="360"/>
+      </w:pPr>
+      <w:rPr>
+        <w:rFonts w:ascii="Wingdings" w:hAnsi="Wingdings" w:hint="default"/>
+      </w:rPr>
+    </w:lvl>
+    <w:lvl w:ilvl="6" w:tplc="04090001" w:tentative="1">
+      <w:start w:val="1"/>
+      <w:numFmt w:val="bullet"/>
+      <w:lvlText w:val=""/>
+      <w:lvlJc w:val="left"/>
+      <w:pPr>
+        <w:ind w:left="4230" w:hanging="360"/>
+      </w:pPr>
+      <w:rPr>
+        <w:rFonts w:ascii="Symbol" w:hAnsi="Symbol" w:hint="default"/>
+      </w:rPr>
+    </w:lvl>
+    <w:lvl w:ilvl="7" w:tplc="04090003" w:tentative="1">
+      <w:start w:val="1"/>
+      <w:numFmt w:val="bullet"/>
+      <w:lvlText w:val="o"/>
+      <w:lvlJc w:val="left"/>
+      <w:pPr>
+        <w:ind w:left="4950" w:hanging="360"/>
+      </w:pPr>
+      <w:rPr>
+        <w:rFonts w:ascii="Courier New" w:hAnsi="Courier New" w:cs="Courier New" w:hint="default"/>
+      </w:rPr>
+    </w:lvl>
+    <w:lvl w:ilvl="8" w:tplc="04090005" w:tentative="1">
+      <w:start w:val="1"/>
+      <w:numFmt w:val="bullet"/>
+      <w:lvlText w:val=""/>
+      <w:lvlJc w:val="left"/>
+      <w:pPr>
+        <w:ind w:left="5670" w:hanging="360"/>
+      </w:pPr>
+      <w:rPr>
+        <w:rFonts w:ascii="Wingdings" w:hAnsi="Wingdings" w:hint="default"/>
+      </w:rPr>
+    </w:lvl>
+  </w:abstractNum>
   <w:num w:numId="1" w16cid:durableId="1669871237">
     <w:abstractNumId w:val="0"/>
+  </w:num>
+  <w:num w:numId="2" w16cid:durableId="218445582">
+    <w:abstractNumId w:val="2"/>
+  </w:num>
+  <w:num w:numId="3" w16cid:durableId="753941435">
+    <w:abstractNumId w:val="1"/>
   </w:num>
 </w:numbering>
 </file>

</xml_diff>